<commit_message>
Order in template fix
</commit_message>
<xml_diff>
--- a/public/files/contract_order_in_cash_template.docx
+++ b/public/files/contract_order_in_cash_template.docx
@@ -356,23 +356,13 @@
                                   <w:szCs w:val="18"/>
                                 </w:rPr>
                               </w:pPr>
-                              <w:proofErr w:type="spellStart"/>
                               <w:r>
                                 <w:rPr>
                                   <w:rFonts w:ascii="Sylfaen" w:hAnsi="Sylfaen"/>
                                   <w:sz w:val="18"/>
                                   <w:szCs w:val="18"/>
                                 </w:rPr>
-                                <w:t>Ամսաթիվ</w:t>
-                              </w:r>
-                              <w:proofErr w:type="spellEnd"/>
-                              <w:r>
-                                <w:rPr>
-                                  <w:rFonts w:ascii="Sylfaen" w:hAnsi="Sylfaen"/>
-                                  <w:sz w:val="18"/>
-                                  <w:szCs w:val="18"/>
-                                </w:rPr>
-                                <w:t xml:space="preserve">՝ </w:t>
+                                <w:t xml:space="preserve">Ամսաթիվ՝ </w:t>
                               </w:r>
                               <w:r>
                                 <w:rPr>
@@ -561,7 +551,6 @@
                                     <w:szCs w:val="15"/>
                                   </w:rPr>
                                 </w:pPr>
-                                <w:proofErr w:type="spellStart"/>
                                 <w:r>
                                   <w:rPr>
                                     <w:rFonts w:ascii="Sylfaen" w:hAnsi="Sylfaen"/>
@@ -570,7 +559,6 @@
                                   </w:rPr>
                                   <w:t>գումար</w:t>
                                 </w:r>
-                                <w:proofErr w:type="spellEnd"/>
                               </w:p>
                             </w:txbxContent>
                           </wps:txbx>
@@ -609,34 +597,14 @@
                                     <w:szCs w:val="15"/>
                                   </w:rPr>
                                 </w:pPr>
-                                <w:proofErr w:type="spellStart"/>
                                 <w:r>
                                   <w:rPr>
                                     <w:rFonts w:ascii="Sylfaen" w:hAnsi="Sylfaen"/>
                                     <w:sz w:val="15"/>
                                     <w:szCs w:val="15"/>
                                   </w:rPr>
-                                  <w:t>գումարը</w:t>
+                                  <w:t>գումարը բառերով</w:t>
                                 </w:r>
-                                <w:proofErr w:type="spellEnd"/>
-                                <w:r>
-                                  <w:rPr>
-                                    <w:rFonts w:ascii="Sylfaen" w:hAnsi="Sylfaen"/>
-                                    <w:sz w:val="15"/>
-                                    <w:szCs w:val="15"/>
-                                  </w:rPr>
-                                  <w:t xml:space="preserve"> </w:t>
-                                </w:r>
-                                <w:proofErr w:type="spellStart"/>
-                                <w:r>
-                                  <w:rPr>
-                                    <w:rFonts w:ascii="Sylfaen" w:hAnsi="Sylfaen"/>
-                                    <w:sz w:val="15"/>
-                                    <w:szCs w:val="15"/>
-                                  </w:rPr>
-                                  <w:t>բառերով</w:t>
-                                </w:r>
-                                <w:proofErr w:type="spellEnd"/>
                               </w:p>
                             </w:txbxContent>
                           </wps:txbx>
@@ -1256,23 +1224,13 @@
                                   <w:szCs w:val="18"/>
                                 </w:rPr>
                               </w:pPr>
-                              <w:proofErr w:type="spellStart"/>
                               <w:r>
                                 <w:rPr>
                                   <w:rFonts w:ascii="Sylfaen" w:hAnsi="Sylfaen"/>
                                   <w:sz w:val="18"/>
                                   <w:szCs w:val="18"/>
                                 </w:rPr>
-                                <w:t>Ամսաթիվ</w:t>
-                              </w:r>
-                              <w:proofErr w:type="spellEnd"/>
-                              <w:r>
-                                <w:rPr>
-                                  <w:rFonts w:ascii="Sylfaen" w:hAnsi="Sylfaen"/>
-                                  <w:sz w:val="18"/>
-                                  <w:szCs w:val="18"/>
-                                </w:rPr>
-                                <w:t xml:space="preserve">՝ </w:t>
+                                <w:t xml:space="preserve">Ամսաթիվ՝ </w:t>
                               </w:r>
                               <w:r>
                                 <w:rPr>
@@ -1461,7 +1419,6 @@
                                     <w:szCs w:val="15"/>
                                   </w:rPr>
                                 </w:pPr>
-                                <w:proofErr w:type="spellStart"/>
                                 <w:r>
                                   <w:rPr>
                                     <w:rFonts w:ascii="Sylfaen" w:hAnsi="Sylfaen"/>
@@ -1470,7 +1427,6 @@
                                   </w:rPr>
                                   <w:t>գումար</w:t>
                                 </w:r>
-                                <w:proofErr w:type="spellEnd"/>
                               </w:p>
                             </w:txbxContent>
                           </wps:txbx>
@@ -1509,34 +1465,14 @@
                                     <w:szCs w:val="15"/>
                                   </w:rPr>
                                 </w:pPr>
-                                <w:proofErr w:type="spellStart"/>
                                 <w:r>
                                   <w:rPr>
                                     <w:rFonts w:ascii="Sylfaen" w:hAnsi="Sylfaen"/>
                                     <w:sz w:val="15"/>
                                     <w:szCs w:val="15"/>
                                   </w:rPr>
-                                  <w:t>գումարը</w:t>
+                                  <w:t>գումարը բառերով</w:t>
                                 </w:r>
-                                <w:proofErr w:type="spellEnd"/>
-                                <w:r>
-                                  <w:rPr>
-                                    <w:rFonts w:ascii="Sylfaen" w:hAnsi="Sylfaen"/>
-                                    <w:sz w:val="15"/>
-                                    <w:szCs w:val="15"/>
-                                  </w:rPr>
-                                  <w:t xml:space="preserve"> </w:t>
-                                </w:r>
-                                <w:proofErr w:type="spellStart"/>
-                                <w:r>
-                                  <w:rPr>
-                                    <w:rFonts w:ascii="Sylfaen" w:hAnsi="Sylfaen"/>
-                                    <w:sz w:val="15"/>
-                                    <w:szCs w:val="15"/>
-                                  </w:rPr>
-                                  <w:t>բառերով</w:t>
-                                </w:r>
-                                <w:proofErr w:type="spellEnd"/>
                               </w:p>
                             </w:txbxContent>
                           </wps:txbx>
@@ -2006,18 +1942,8 @@
                                 <w:sz w:val="18"/>
                                 <w:szCs w:val="18"/>
                               </w:rPr>
-                              <w:t xml:space="preserve">ՀՀ </w:t>
+                              <w:t>ՀՀ դրամ</w:t>
                             </w:r>
-                            <w:proofErr w:type="spellStart"/>
-                            <w:r>
-                              <w:rPr>
-                                <w:rFonts w:ascii="Sylfaen" w:hAnsi="Sylfaen"/>
-                                <w:sz w:val="18"/>
-                                <w:szCs w:val="18"/>
-                              </w:rPr>
-                              <w:t>դրամ</w:t>
-                            </w:r>
-                            <w:proofErr w:type="spellEnd"/>
                           </w:p>
                         </w:txbxContent>
                       </wps:txbx>
@@ -2162,18 +2088,8 @@
                                 <w:sz w:val="18"/>
                                 <w:szCs w:val="18"/>
                               </w:rPr>
-                              <w:t xml:space="preserve">ՀՀ </w:t>
+                              <w:t>ՀՀ դրամ</w:t>
                             </w:r>
-                            <w:proofErr w:type="spellStart"/>
-                            <w:r>
-                              <w:rPr>
-                                <w:rFonts w:ascii="Sylfaen" w:hAnsi="Sylfaen"/>
-                                <w:sz w:val="18"/>
-                                <w:szCs w:val="18"/>
-                              </w:rPr>
-                              <w:t>դրամ</w:t>
-                            </w:r>
-                            <w:proofErr w:type="spellEnd"/>
                           </w:p>
                         </w:txbxContent>
                       </wps:txbx>
@@ -2310,18 +2226,8 @@
                                 <w:sz w:val="18"/>
                                 <w:szCs w:val="18"/>
                               </w:rPr>
-                              <w:t xml:space="preserve">ՀՀ </w:t>
+                              <w:t>ՀՀ դրամ</w:t>
                             </w:r>
-                            <w:proofErr w:type="spellStart"/>
-                            <w:r>
-                              <w:rPr>
-                                <w:rFonts w:ascii="Sylfaen" w:hAnsi="Sylfaen"/>
-                                <w:sz w:val="18"/>
-                                <w:szCs w:val="18"/>
-                              </w:rPr>
-                              <w:t>դրամ</w:t>
-                            </w:r>
-                            <w:proofErr w:type="spellEnd"/>
                           </w:p>
                           <w:p>
                             <w:pPr>
@@ -2473,18 +2379,8 @@
                                 <w:sz w:val="18"/>
                                 <w:szCs w:val="18"/>
                               </w:rPr>
-                              <w:t xml:space="preserve">ՀՀ </w:t>
+                              <w:t>ՀՀ դրամ</w:t>
                             </w:r>
-                            <w:proofErr w:type="spellStart"/>
-                            <w:r>
-                              <w:rPr>
-                                <w:rFonts w:ascii="Sylfaen" w:hAnsi="Sylfaen"/>
-                                <w:sz w:val="18"/>
-                                <w:szCs w:val="18"/>
-                              </w:rPr>
-                              <w:t>դրամ</w:t>
-                            </w:r>
-                            <w:proofErr w:type="spellEnd"/>
                           </w:p>
                         </w:txbxContent>
                       </wps:txbx>
@@ -2563,7 +2459,6 @@
         </w:rPr>
         <w:t xml:space="preserve"> </w:t>
       </w:r>
-      <w:proofErr w:type="spellStart"/>
       <w:r>
         <w:rPr>
           <w:rFonts w:ascii="Sylfaen" w:hAnsi="Sylfaen"/>
@@ -2572,7 +2467,6 @@
         </w:rPr>
         <w:t>Վճարող</w:t>
       </w:r>
-      <w:proofErr w:type="spellEnd"/>
       <w:r>
         <w:rPr>
           <w:rFonts w:ascii="Sylfaen" w:hAnsi="Sylfaen"/>
@@ -2614,23 +2508,13 @@
         </w:rPr>
         <w:br/>
       </w:r>
-      <w:proofErr w:type="spellStart"/>
       <w:r>
         <w:rPr>
           <w:rFonts w:ascii="Sylfaen" w:hAnsi="Sylfaen"/>
           <w:sz w:val="20"/>
           <w:szCs w:val="20"/>
         </w:rPr>
-        <w:t>Պայմանագրի</w:t>
-      </w:r>
-      <w:proofErr w:type="spellEnd"/>
-      <w:r>
-        <w:rPr>
-          <w:rFonts w:ascii="Sylfaen" w:hAnsi="Sylfaen"/>
-          <w:sz w:val="20"/>
-          <w:szCs w:val="20"/>
-        </w:rPr>
-        <w:t xml:space="preserve"> N </w:t>
+        <w:t xml:space="preserve">Պայմանագրի N </w:t>
       </w:r>
       <w:r>
         <w:rPr>
@@ -2659,7 +2543,7 @@
           <w:iCs/>
           <w:lang w:val="en-GB"/>
         </w:rPr>
-        <w:t>order</w:t>
+        <w:t>num</w:t>
       </w:r>
       <w:r>
         <w:rPr>
@@ -2680,23 +2564,13 @@
         </w:rPr>
         <w:br/>
       </w:r>
-      <w:proofErr w:type="spellStart"/>
       <w:r>
         <w:rPr>
           <w:rFonts w:ascii="Sylfaen" w:hAnsi="Sylfaen"/>
           <w:sz w:val="20"/>
           <w:szCs w:val="20"/>
         </w:rPr>
-        <w:t>Նպատակ</w:t>
-      </w:r>
-      <w:proofErr w:type="spellEnd"/>
-      <w:r>
-        <w:rPr>
-          <w:rFonts w:ascii="Sylfaen" w:hAnsi="Sylfaen"/>
-          <w:sz w:val="20"/>
-          <w:szCs w:val="20"/>
-        </w:rPr>
-        <w:t xml:space="preserve"> </w:t>
+        <w:t xml:space="preserve">Նպատակ </w:t>
       </w:r>
       <w:r>
         <w:rPr>
@@ -2705,7 +2579,6 @@
         <w:br/>
         <w:t xml:space="preserve">  </w:t>
       </w:r>
-      <w:proofErr w:type="spellStart"/>
       <w:r>
         <w:rPr>
           <w:rFonts w:ascii="Sylfaen" w:hAnsi="Sylfaen"/>
@@ -2714,31 +2587,8 @@
           <w:i/>
           <w:iCs/>
         </w:rPr>
-        <w:t>Հերթական</w:t>
+        <w:t>Հերթական վճարում</w:t>
       </w:r>
-      <w:proofErr w:type="spellEnd"/>
-      <w:r>
-        <w:rPr>
-          <w:rFonts w:ascii="Sylfaen" w:hAnsi="Sylfaen"/>
-          <w:b/>
-          <w:bCs/>
-          <w:i/>
-          <w:iCs/>
-        </w:rPr>
-        <w:t xml:space="preserve"> </w:t>
-      </w:r>
-      <w:proofErr w:type="spellStart"/>
-      <w:r>
-        <w:rPr>
-          <w:rFonts w:ascii="Sylfaen" w:hAnsi="Sylfaen"/>
-          <w:b/>
-          <w:bCs/>
-          <w:i/>
-          <w:iCs/>
-        </w:rPr>
-        <w:t>վճարում</w:t>
-      </w:r>
-      <w:proofErr w:type="spellEnd"/>
       <w:r>
         <w:rPr>
           <w:rFonts w:ascii="Sylfaen" w:hAnsi="Sylfaen"/>
@@ -2755,7 +2605,6 @@
         </w:rPr>
         <w:br/>
       </w:r>
-      <w:proofErr w:type="spellStart"/>
       <w:r>
         <w:rPr>
           <w:rFonts w:ascii="Sylfaen" w:hAnsi="Sylfaen"/>
@@ -2764,7 +2613,6 @@
         </w:rPr>
         <w:t>Հիմք</w:t>
       </w:r>
-      <w:proofErr w:type="spellEnd"/>
       <w:r>
         <w:rPr>
           <w:rFonts w:ascii="Sylfaen" w:hAnsi="Sylfaen"/>
@@ -2772,7 +2620,6 @@
         <w:br/>
         <w:t xml:space="preserve">  </w:t>
       </w:r>
-      <w:proofErr w:type="spellStart"/>
       <w:r>
         <w:rPr>
           <w:rFonts w:ascii="Sylfaen" w:hAnsi="Sylfaen"/>
@@ -2781,18 +2628,7 @@
           <w:i/>
           <w:iCs/>
         </w:rPr>
-        <w:t>Հեռ</w:t>
-      </w:r>
-      <w:proofErr w:type="spellEnd"/>
-      <w:r>
-        <w:rPr>
-          <w:rFonts w:ascii="Sylfaen" w:hAnsi="Sylfaen"/>
-          <w:b/>
-          <w:bCs/>
-          <w:i/>
-          <w:iCs/>
-        </w:rPr>
-        <w:t>.</w:t>
+        <w:t>Հեռ.</w:t>
       </w:r>
       <w:r>
         <w:rPr>
@@ -2826,35 +2662,16 @@
           <w:szCs w:val="20"/>
         </w:rPr>
         <w:br/>
+        <w:t xml:space="preserve">Կատարող՝ </w:t>
       </w:r>
-      <w:proofErr w:type="spellStart"/>
       <w:r>
         <w:rPr>
           <w:rFonts w:ascii="Sylfaen" w:hAnsi="Sylfaen"/>
           <w:sz w:val="20"/>
           <w:szCs w:val="20"/>
         </w:rPr>
-        <w:t>Կատարող</w:t>
+        <w:t>՝ ${executor}</w:t>
       </w:r>
-      <w:proofErr w:type="spellEnd"/>
-      <w:r>
-        <w:rPr>
-          <w:rFonts w:ascii="Sylfaen" w:hAnsi="Sylfaen"/>
-          <w:sz w:val="20"/>
-          <w:szCs w:val="20"/>
-        </w:rPr>
-        <w:t xml:space="preserve">՝ </w:t>
-      </w:r>
-      <w:proofErr w:type="spellStart"/>
-      <w:r>
-        <w:rPr>
-          <w:rFonts w:ascii="Sylfaen" w:hAnsi="Sylfaen"/>
-          <w:sz w:val="20"/>
-          <w:szCs w:val="20"/>
-        </w:rPr>
-        <w:t>Սոնա</w:t>
-      </w:r>
-      <w:proofErr w:type="spellEnd"/>
       <w:r>
         <w:rPr>
           <w:rFonts w:ascii="Sylfaen" w:hAnsi="Sylfaen"/>
@@ -2863,41 +2680,13 @@
         </w:rPr>
         <w:t xml:space="preserve"> </w:t>
       </w:r>
-      <w:proofErr w:type="spellStart"/>
       <w:r>
         <w:rPr>
           <w:rFonts w:ascii="Sylfaen" w:hAnsi="Sylfaen"/>
           <w:sz w:val="20"/>
           <w:szCs w:val="20"/>
         </w:rPr>
-        <w:t>Մինասյան</w:t>
-      </w:r>
-      <w:proofErr w:type="spellEnd"/>
-      <w:r>
-        <w:rPr>
-          <w:rFonts w:ascii="Sylfaen" w:hAnsi="Sylfaen"/>
-          <w:sz w:val="20"/>
-          <w:szCs w:val="20"/>
-        </w:rPr>
-        <w:t xml:space="preserve">                    </w:t>
-      </w:r>
-      <w:proofErr w:type="spellStart"/>
-      <w:r>
-        <w:rPr>
-          <w:rFonts w:ascii="Sylfaen" w:hAnsi="Sylfaen"/>
-          <w:sz w:val="20"/>
-          <w:szCs w:val="20"/>
-        </w:rPr>
-        <w:t>Վճարող</w:t>
-      </w:r>
-      <w:proofErr w:type="spellEnd"/>
-      <w:r>
-        <w:rPr>
-          <w:rFonts w:ascii="Sylfaen" w:hAnsi="Sylfaen"/>
-          <w:sz w:val="20"/>
-          <w:szCs w:val="20"/>
-        </w:rPr>
-        <w:t xml:space="preserve">՝      ____________________                                        </w:t>
+        <w:t xml:space="preserve">Վճարող՝      ____________________                                        </w:t>
       </w:r>
       <w:r>
         <w:rPr>
@@ -2947,7 +2736,6 @@
         </w:rPr>
         <w:br/>
       </w:r>
-      <w:proofErr w:type="spellStart"/>
       <w:r>
         <w:rPr>
           <w:rFonts w:ascii="Sylfaen" w:hAnsi="Sylfaen"/>
@@ -2956,7 +2744,6 @@
         </w:rPr>
         <w:t>Վճարող</w:t>
       </w:r>
-      <w:proofErr w:type="spellEnd"/>
       <w:r>
         <w:rPr>
           <w:rFonts w:ascii="Sylfaen" w:hAnsi="Sylfaen"/>
@@ -2998,23 +2785,13 @@
         </w:rPr>
         <w:br/>
       </w:r>
-      <w:proofErr w:type="spellStart"/>
       <w:r>
         <w:rPr>
           <w:rFonts w:ascii="Sylfaen" w:hAnsi="Sylfaen"/>
           <w:sz w:val="20"/>
           <w:szCs w:val="20"/>
         </w:rPr>
-        <w:t>Պայմանագրի</w:t>
-      </w:r>
-      <w:proofErr w:type="spellEnd"/>
-      <w:r>
-        <w:rPr>
-          <w:rFonts w:ascii="Sylfaen" w:hAnsi="Sylfaen"/>
-          <w:sz w:val="20"/>
-          <w:szCs w:val="20"/>
-        </w:rPr>
-        <w:t xml:space="preserve"> N </w:t>
+        <w:t xml:space="preserve">Պայմանագրի N </w:t>
       </w:r>
       <w:r>
         <w:rPr>
@@ -3043,7 +2820,7 @@
           <w:iCs/>
           <w:lang w:val="en-GB"/>
         </w:rPr>
-        <w:t>order</w:t>
+        <w:t>num</w:t>
       </w:r>
       <w:r>
         <w:rPr>
@@ -3064,23 +2841,13 @@
         </w:rPr>
         <w:br/>
       </w:r>
-      <w:proofErr w:type="spellStart"/>
       <w:r>
         <w:rPr>
           <w:rFonts w:ascii="Sylfaen" w:hAnsi="Sylfaen"/>
           <w:sz w:val="20"/>
           <w:szCs w:val="20"/>
         </w:rPr>
-        <w:t>Նպատակ</w:t>
-      </w:r>
-      <w:proofErr w:type="spellEnd"/>
-      <w:r>
-        <w:rPr>
-          <w:rFonts w:ascii="Sylfaen" w:hAnsi="Sylfaen"/>
-          <w:sz w:val="20"/>
-          <w:szCs w:val="20"/>
-        </w:rPr>
-        <w:t xml:space="preserve"> </w:t>
+        <w:t xml:space="preserve">Նպատակ </w:t>
       </w:r>
       <w:r>
         <w:rPr>
@@ -3089,7 +2856,6 @@
         <w:br/>
         <w:t xml:space="preserve">  </w:t>
       </w:r>
-      <w:proofErr w:type="spellStart"/>
       <w:r>
         <w:rPr>
           <w:rFonts w:ascii="Sylfaen" w:hAnsi="Sylfaen"/>
@@ -3098,31 +2864,8 @@
           <w:i/>
           <w:iCs/>
         </w:rPr>
-        <w:t>Հերթական</w:t>
+        <w:t>Հերթական վճարում</w:t>
       </w:r>
-      <w:proofErr w:type="spellEnd"/>
-      <w:r>
-        <w:rPr>
-          <w:rFonts w:ascii="Sylfaen" w:hAnsi="Sylfaen"/>
-          <w:b/>
-          <w:bCs/>
-          <w:i/>
-          <w:iCs/>
-        </w:rPr>
-        <w:t xml:space="preserve"> </w:t>
-      </w:r>
-      <w:proofErr w:type="spellStart"/>
-      <w:r>
-        <w:rPr>
-          <w:rFonts w:ascii="Sylfaen" w:hAnsi="Sylfaen"/>
-          <w:b/>
-          <w:bCs/>
-          <w:i/>
-          <w:iCs/>
-        </w:rPr>
-        <w:t>վճարում</w:t>
-      </w:r>
-      <w:proofErr w:type="spellEnd"/>
       <w:r>
         <w:rPr>
           <w:rFonts w:ascii="Sylfaen" w:hAnsi="Sylfaen"/>
@@ -3139,7 +2882,6 @@
         </w:rPr>
         <w:br/>
       </w:r>
-      <w:proofErr w:type="spellStart"/>
       <w:r>
         <w:rPr>
           <w:rFonts w:ascii="Sylfaen" w:hAnsi="Sylfaen"/>
@@ -3148,7 +2890,6 @@
         </w:rPr>
         <w:t>Հիմք</w:t>
       </w:r>
-      <w:proofErr w:type="spellEnd"/>
       <w:r>
         <w:rPr>
           <w:rFonts w:ascii="Sylfaen" w:hAnsi="Sylfaen"/>
@@ -3156,7 +2897,6 @@
         <w:br/>
         <w:t xml:space="preserve">  </w:t>
       </w:r>
-      <w:proofErr w:type="spellStart"/>
       <w:r>
         <w:rPr>
           <w:rFonts w:ascii="Sylfaen" w:hAnsi="Sylfaen"/>
@@ -3165,18 +2905,7 @@
           <w:i/>
           <w:iCs/>
         </w:rPr>
-        <w:t>Հեռ</w:t>
-      </w:r>
-      <w:proofErr w:type="spellEnd"/>
-      <w:r>
-        <w:rPr>
-          <w:rFonts w:ascii="Sylfaen" w:hAnsi="Sylfaen"/>
-          <w:b/>
-          <w:bCs/>
-          <w:i/>
-          <w:iCs/>
-        </w:rPr>
-        <w:t>.</w:t>
+        <w:t>Հեռ.</w:t>
       </w:r>
       <w:r>
         <w:rPr>
@@ -3210,35 +2939,16 @@
           <w:szCs w:val="20"/>
         </w:rPr>
         <w:br/>
+        <w:t xml:space="preserve">Կատարող՝ </w:t>
       </w:r>
-      <w:proofErr w:type="spellStart"/>
       <w:r>
         <w:rPr>
           <w:rFonts w:ascii="Sylfaen" w:hAnsi="Sylfaen"/>
           <w:sz w:val="20"/>
           <w:szCs w:val="20"/>
         </w:rPr>
-        <w:t>Կատարող</w:t>
+        <w:t>՝ ${executor}</w:t>
       </w:r>
-      <w:proofErr w:type="spellEnd"/>
-      <w:r>
-        <w:rPr>
-          <w:rFonts w:ascii="Sylfaen" w:hAnsi="Sylfaen"/>
-          <w:sz w:val="20"/>
-          <w:szCs w:val="20"/>
-        </w:rPr>
-        <w:t xml:space="preserve">՝ </w:t>
-      </w:r>
-      <w:proofErr w:type="spellStart"/>
-      <w:r>
-        <w:rPr>
-          <w:rFonts w:ascii="Sylfaen" w:hAnsi="Sylfaen"/>
-          <w:sz w:val="20"/>
-          <w:szCs w:val="20"/>
-        </w:rPr>
-        <w:t>Սոնա</w:t>
-      </w:r>
-      <w:proofErr w:type="spellEnd"/>
       <w:r>
         <w:rPr>
           <w:rFonts w:ascii="Sylfaen" w:hAnsi="Sylfaen"/>
@@ -3247,41 +2957,13 @@
         </w:rPr>
         <w:t xml:space="preserve"> </w:t>
       </w:r>
-      <w:proofErr w:type="spellStart"/>
       <w:r>
         <w:rPr>
           <w:rFonts w:ascii="Sylfaen" w:hAnsi="Sylfaen"/>
           <w:sz w:val="20"/>
           <w:szCs w:val="20"/>
         </w:rPr>
-        <w:t>Մինասյան</w:t>
-      </w:r>
-      <w:proofErr w:type="spellEnd"/>
-      <w:r>
-        <w:rPr>
-          <w:rFonts w:ascii="Sylfaen" w:hAnsi="Sylfaen"/>
-          <w:sz w:val="20"/>
-          <w:szCs w:val="20"/>
-        </w:rPr>
-        <w:t xml:space="preserve">                    </w:t>
-      </w:r>
-      <w:proofErr w:type="spellStart"/>
-      <w:r>
-        <w:rPr>
-          <w:rFonts w:ascii="Sylfaen" w:hAnsi="Sylfaen"/>
-          <w:sz w:val="20"/>
-          <w:szCs w:val="20"/>
-        </w:rPr>
-        <w:t>Վճարող</w:t>
-      </w:r>
-      <w:proofErr w:type="spellEnd"/>
-      <w:r>
-        <w:rPr>
-          <w:rFonts w:ascii="Sylfaen" w:hAnsi="Sylfaen"/>
-          <w:sz w:val="20"/>
-          <w:szCs w:val="20"/>
-        </w:rPr>
-        <w:t xml:space="preserve">՝      ____________________                                        </w:t>
+        <w:t xml:space="preserve">Վճարող՝      ____________________                                        </w:t>
       </w:r>
     </w:p>
     <w:sectPr>

</xml_diff>